<commit_message>
ready for start coding
</commit_message>
<xml_diff>
--- a/doc/ТЗ.docx
+++ b/doc/ТЗ.docx
@@ -576,15 +576,7 @@
           <w:sz w:val="28"/>
           <w:szCs w:val="28"/>
         </w:rPr>
-        <w:t>Изучение списков анкет (резюме и вакансий</w:t>
-      </w:r>
-      <w:r>
-        <w:rPr>
-          <w:rFonts w:ascii="Times New Roman" w:hAnsi="Times New Roman" w:cs="Times New Roman"/>
-          <w:sz w:val="28"/>
-          <w:szCs w:val="28"/>
-        </w:rPr>
-        <w:t>);</w:t>
+        <w:t>Изучение списков анкет (резюме и вакансий);</w:t>
       </w:r>
     </w:p>
     <w:p>
@@ -1491,7 +1483,23 @@
           <w:sz w:val="28"/>
           <w:szCs w:val="28"/>
         </w:rPr>
-        <w:t>Необходимо реализовать верификацию пользователей: до тех пор, пока их данные не будут подтверждены, основной функционал для низ блокируется. Механизм подтверждения пользователей предусматривается разработчиком, но существуют следующие рекомендации (ОУ – образовательное учреждение):</w:t>
+        <w:t>Необходимо реализовать верификацию пользователей: до тех пор, пока их данные не будут подтверждены, основной функционал для ни</w:t>
+      </w:r>
+      <w:r>
+        <w:rPr>
+          <w:rFonts w:ascii="Times New Roman" w:hAnsi="Times New Roman" w:cs="Times New Roman"/>
+          <w:sz w:val="28"/>
+          <w:szCs w:val="28"/>
+        </w:rPr>
+        <w:t>х</w:t>
+      </w:r>
+      <w:r>
+        <w:rPr>
+          <w:rFonts w:ascii="Times New Roman" w:hAnsi="Times New Roman" w:cs="Times New Roman"/>
+          <w:sz w:val="28"/>
+          <w:szCs w:val="28"/>
+        </w:rPr>
+        <w:t xml:space="preserve"> блокируется. Механизм подтверждения пользователей предусматривается разработчиком, но существуют следующие рекомендации (ОУ – образовательное учреждение):</w:t>
       </w:r>
     </w:p>
     <w:p>
@@ -3529,7 +3537,21 @@
                 <w:rFonts w:ascii="Times New Roman" w:hAnsi="Times New Roman" w:cs="Times New Roman"/>
                 <w:sz w:val="28"/>
               </w:rPr>
-              <w:t>Процент от общего бюджета, потраченный на прямые затраты (не включая волонтерский труд)</w:t>
+              <w:t xml:space="preserve">Процент от общего бюджета, потраченный на прямые затраты (не включая </w:t>
+            </w:r>
+            <w:r>
+              <w:rPr>
+                <w:rFonts w:ascii="Times New Roman" w:hAnsi="Times New Roman" w:cs="Times New Roman"/>
+                <w:sz w:val="28"/>
+              </w:rPr>
+              <w:t>волонтёрский</w:t>
+            </w:r>
+            <w:r>
+              <w:rPr>
+                <w:rFonts w:ascii="Times New Roman" w:hAnsi="Times New Roman" w:cs="Times New Roman"/>
+                <w:sz w:val="28"/>
+              </w:rPr>
+              <w:t xml:space="preserve"> труд)</w:t>
             </w:r>
           </w:p>
         </w:tc>
@@ -4867,7 +4889,21 @@
                 <w:rFonts w:ascii="Times New Roman" w:hAnsi="Times New Roman" w:cs="Times New Roman"/>
                 <w:sz w:val="28"/>
               </w:rPr>
-              <w:t>ценка удовлетворенности пользователей</w:t>
+              <w:t xml:space="preserve">ценка </w:t>
+            </w:r>
+            <w:r>
+              <w:rPr>
+                <w:rFonts w:ascii="Times New Roman" w:hAnsi="Times New Roman" w:cs="Times New Roman"/>
+                <w:sz w:val="28"/>
+              </w:rPr>
+              <w:t>удовлетворённости</w:t>
+            </w:r>
+            <w:r>
+              <w:rPr>
+                <w:rFonts w:ascii="Times New Roman" w:hAnsi="Times New Roman" w:cs="Times New Roman"/>
+                <w:sz w:val="28"/>
+              </w:rPr>
+              <w:t xml:space="preserve"> пользователей</w:t>
             </w:r>
             <w:r>
               <w:rPr>

</xml_diff>